<commit_message>
fix(docx): apply ContrastGuard to document defaults, alerts, table cells, hyperlinks, and TOC styles
</commit_message>
<xml_diff>
--- a/tests/docx_verify_output/emdash_sample.docx
+++ b/tests/docx_verify_output/emdash_sample.docx
@@ -91,8 +91,8 @@
       </w:pPr>
     </w:p>
     <w:sectPr>
-      <w:headerReference xmlns:r="http://schemas.openxmlformats.org/officeDocument/2006/relationships" w:type="default" r:id="R11ca7bed16d94df3"/>
-      <w:footerReference xmlns:r="http://schemas.openxmlformats.org/officeDocument/2006/relationships" w:type="default" r:id="R522e0b38f16f4b9b"/>
+      <w:headerReference xmlns:r="http://schemas.openxmlformats.org/officeDocument/2006/relationships" w:type="default" r:id="R888d828b653b4e63"/>
+      <w:footerReference xmlns:r="http://schemas.openxmlformats.org/officeDocument/2006/relationships" w:type="default" r:id="Re9e0d723a7f4479c"/>
       <w:pgSz w:w="11906" w:h="16838"/>
       <w:pgMar w:top="1440" w:right="1440" w:bottom="1440" w:left="1440" w:header="576" w:footer="576" w:gutter="0"/>
       <w:pgBorders w:display="allPages" w:offsetFrom="page">
@@ -493,5 +493,26 @@
       <w:u w:val="single"/>
     </w:rPr>
   </w:style>
+  <w:style w:type="paragraph" w:styleId="TOC1">
+    <w:name w:val="toc 1"/>
+    <w:basedOn w:val="Normal"/>
+    <w:rPr>
+      <w:color w:val="1b1f23"/>
+    </w:rPr>
+  </w:style>
+  <w:style w:type="paragraph" w:styleId="TOC2">
+    <w:name w:val="toc 2"/>
+    <w:basedOn w:val="Normal"/>
+    <w:rPr>
+      <w:color w:val="1b1f23"/>
+    </w:rPr>
+  </w:style>
+  <w:style w:type="paragraph" w:styleId="TOC3">
+    <w:name w:val="toc 3"/>
+    <w:basedOn w:val="Normal"/>
+    <w:rPr>
+      <w:color w:val="1b1f23"/>
+    </w:rPr>
+  </w:style>
 </w:styles>
 </file>
</xml_diff>

<commit_message>
fix(docx): repair dark theme container background fills, drop cap text shear, and flowchart node fills
</commit_message>
<xml_diff>
--- a/tests/docx_verify_output/emdash_sample.docx
+++ b/tests/docx_verify_output/emdash_sample.docx
@@ -91,8 +91,8 @@
       </w:pPr>
     </w:p>
     <w:sectPr>
-      <w:headerReference xmlns:r="http://schemas.openxmlformats.org/officeDocument/2006/relationships" w:type="default" r:id="R888d828b653b4e63"/>
-      <w:footerReference xmlns:r="http://schemas.openxmlformats.org/officeDocument/2006/relationships" w:type="default" r:id="Re9e0d723a7f4479c"/>
+      <w:headerReference xmlns:r="http://schemas.openxmlformats.org/officeDocument/2006/relationships" w:type="default" r:id="R82e3a492813a421a"/>
+      <w:footerReference xmlns:r="http://schemas.openxmlformats.org/officeDocument/2006/relationships" w:type="default" r:id="R0042d7ba64d74010"/>
       <w:pgSz w:w="11906" w:h="16838"/>
       <w:pgMar w:top="1440" w:right="1440" w:bottom="1440" w:left="1440" w:header="576" w:footer="576" w:gutter="0"/>
       <w:pgBorders w:display="allPages" w:offsetFrom="page">

</xml_diff>

<commit_message>
fix(html-preview): remove invalid font[color] and span[style*=color] inherit CSS rules so explicit inline HTML and multi-color fonts work
</commit_message>
<xml_diff>
--- a/tests/docx_verify_output/emdash_sample.docx
+++ b/tests/docx_verify_output/emdash_sample.docx
@@ -91,8 +91,8 @@
       </w:pPr>
     </w:p>
     <w:sectPr>
-      <w:headerReference xmlns:r="http://schemas.openxmlformats.org/officeDocument/2006/relationships" w:type="default" r:id="R82e3a492813a421a"/>
-      <w:footerReference xmlns:r="http://schemas.openxmlformats.org/officeDocument/2006/relationships" w:type="default" r:id="R0042d7ba64d74010"/>
+      <w:headerReference xmlns:r="http://schemas.openxmlformats.org/officeDocument/2006/relationships" w:type="default" r:id="Rb4786da0d9ce40ca"/>
+      <w:footerReference xmlns:r="http://schemas.openxmlformats.org/officeDocument/2006/relationships" w:type="default" r:id="Rf4cf5b52ef064f97"/>
       <w:pgSz w:w="11906" w:h="16838"/>
       <w:pgMar w:top="1440" w:right="1440" w:bottom="1440" w:left="1440" w:header="576" w:footer="576" w:gutter="0"/>
       <w:pgBorders w:display="allPages" w:offsetFrom="page">

</xml_diff>

<commit_message>
test(docx): add GoldenDocumentVerificationTests to catch Mojibake bytes, unexpected Greek/symbol corruptions in prose, callouts, and contrast
</commit_message>
<xml_diff>
--- a/tests/docx_verify_output/emdash_sample.docx
+++ b/tests/docx_verify_output/emdash_sample.docx
@@ -91,8 +91,8 @@
       </w:pPr>
     </w:p>
     <w:sectPr>
-      <w:headerReference xmlns:r="http://schemas.openxmlformats.org/officeDocument/2006/relationships" w:type="default" r:id="Rb4786da0d9ce40ca"/>
-      <w:footerReference xmlns:r="http://schemas.openxmlformats.org/officeDocument/2006/relationships" w:type="default" r:id="Rf4cf5b52ef064f97"/>
+      <w:headerReference xmlns:r="http://schemas.openxmlformats.org/officeDocument/2006/relationships" w:type="default" r:id="R947d023ce37e40f2"/>
+      <w:footerReference xmlns:r="http://schemas.openxmlformats.org/officeDocument/2006/relationships" w:type="default" r:id="R98799caf5eaf4e90"/>
       <w:pgSz w:w="11906" w:h="16838"/>
       <w:pgMar w:top="1440" w:right="1440" w:bottom="1440" w:left="1440" w:header="576" w:footer="576" w:gutter="0"/>
       <w:pgBorders w:display="allPages" w:offsetFrom="page">

</xml_diff>

<commit_message>
feat(ui): add multi-page break backdrop dividers in preview and prominent PDF vs DOCX format selector
</commit_message>
<xml_diff>
--- a/tests/docx_verify_output/emdash_sample.docx
+++ b/tests/docx_verify_output/emdash_sample.docx
@@ -91,8 +91,8 @@
       </w:pPr>
     </w:p>
     <w:sectPr>
-      <w:headerReference xmlns:r="http://schemas.openxmlformats.org/officeDocument/2006/relationships" w:type="default" r:id="R947d023ce37e40f2"/>
-      <w:footerReference xmlns:r="http://schemas.openxmlformats.org/officeDocument/2006/relationships" w:type="default" r:id="R98799caf5eaf4e90"/>
+      <w:headerReference xmlns:r="http://schemas.openxmlformats.org/officeDocument/2006/relationships" w:type="default" r:id="R1d3201b8c6224f48"/>
+      <w:footerReference xmlns:r="http://schemas.openxmlformats.org/officeDocument/2006/relationships" w:type="default" r:id="Rd2f6bfb3f5e04d81"/>
       <w:pgSz w:w="11906" w:h="16838"/>
       <w:pgMar w:top="1440" w:right="1440" w:bottom="1440" w:left="1440" w:header="576" w:footer="576" w:gutter="0"/>
       <w:pgBorders w:display="allPages" w:offsetFrom="page">

</xml_diff>

<commit_message>
fix(docx): force Web Layout view for dark themes like Cyberpunk so Word renders document background and neon palette
</commit_message>
<xml_diff>
--- a/tests/docx_verify_output/emdash_sample.docx
+++ b/tests/docx_verify_output/emdash_sample.docx
@@ -91,8 +91,8 @@
       </w:pPr>
     </w:p>
     <w:sectPr>
-      <w:headerReference xmlns:r="http://schemas.openxmlformats.org/officeDocument/2006/relationships" w:type="default" r:id="R1d3201b8c6224f48"/>
-      <w:footerReference xmlns:r="http://schemas.openxmlformats.org/officeDocument/2006/relationships" w:type="default" r:id="Rd2f6bfb3f5e04d81"/>
+      <w:headerReference xmlns:r="http://schemas.openxmlformats.org/officeDocument/2006/relationships" w:type="default" r:id="R03736c0e3e264411"/>
+      <w:footerReference xmlns:r="http://schemas.openxmlformats.org/officeDocument/2006/relationships" w:type="default" r:id="R55a474f2da0d4699"/>
       <w:pgSz w:w="11906" w:h="16838"/>
       <w:pgMar w:top="1440" w:right="1440" w:bottom="1440" w:left="1440" w:header="576" w:footer="576" w:gutter="0"/>
       <w:pgBorders w:display="allPages" w:offsetFrom="page">

</xml_diff>

<commit_message>
fix(docx): wire ViewModel Host in Avalonia Loaded handler to enable Mermaid geometry harvesting and fix Open Output button
</commit_message>
<xml_diff>
--- a/tests/docx_verify_output/emdash_sample.docx
+++ b/tests/docx_verify_output/emdash_sample.docx
@@ -91,8 +91,8 @@
       </w:pPr>
     </w:p>
     <w:sectPr>
-      <w:headerReference xmlns:r="http://schemas.openxmlformats.org/officeDocument/2006/relationships" w:type="default" r:id="R03736c0e3e264411"/>
-      <w:footerReference xmlns:r="http://schemas.openxmlformats.org/officeDocument/2006/relationships" w:type="default" r:id="R55a474f2da0d4699"/>
+      <w:headerReference xmlns:r="http://schemas.openxmlformats.org/officeDocument/2006/relationships" w:type="default" r:id="R969db49ecc634442"/>
+      <w:footerReference xmlns:r="http://schemas.openxmlformats.org/officeDocument/2006/relationships" w:type="default" r:id="R487b2608aba149f7"/>
       <w:pgSz w:w="11906" w:h="16838"/>
       <w:pgMar w:top="1440" w:right="1440" w:bottom="1440" w:left="1440" w:header="576" w:footer="576" w:gutter="0"/>
       <w:pgBorders w:display="allPages" w:offsetFrom="page">

</xml_diff>

<commit_message>
security(license): update EULA, strengthen .gitignore against private key / token leaks before repository public release
</commit_message>
<xml_diff>
--- a/tests/docx_verify_output/emdash_sample.docx
+++ b/tests/docx_verify_output/emdash_sample.docx
@@ -91,8 +91,8 @@
       </w:pPr>
     </w:p>
     <w:sectPr>
-      <w:headerReference xmlns:r="http://schemas.openxmlformats.org/officeDocument/2006/relationships" w:type="default" r:id="R969db49ecc634442"/>
-      <w:footerReference xmlns:r="http://schemas.openxmlformats.org/officeDocument/2006/relationships" w:type="default" r:id="R487b2608aba149f7"/>
+      <w:headerReference xmlns:r="http://schemas.openxmlformats.org/officeDocument/2006/relationships" w:type="default" r:id="Rfed0a7de89f64fa5"/>
+      <w:footerReference xmlns:r="http://schemas.openxmlformats.org/officeDocument/2006/relationships" w:type="default" r:id="R61c3be526f6d4d3f"/>
       <w:pgSz w:w="11906" w:h="16838"/>
       <w:pgMar w:top="1440" w:right="1440" w:bottom="1440" w:left="1440" w:header="576" w:footer="576" w:gutter="0"/>
       <w:pgBorders w:display="allPages" w:offsetFrom="page">

</xml_diff>

<commit_message>
fix(docx): fetch and embed remote URLs, base64 Data URIs, and SVG images as native Word drawings
</commit_message>
<xml_diff>
--- a/tests/docx_verify_output/emdash_sample.docx
+++ b/tests/docx_verify_output/emdash_sample.docx
@@ -91,8 +91,8 @@
       </w:pPr>
     </w:p>
     <w:sectPr>
-      <w:headerReference xmlns:r="http://schemas.openxmlformats.org/officeDocument/2006/relationships" w:type="default" r:id="Rfed0a7de89f64fa5"/>
-      <w:footerReference xmlns:r="http://schemas.openxmlformats.org/officeDocument/2006/relationships" w:type="default" r:id="R61c3be526f6d4d3f"/>
+      <w:headerReference xmlns:r="http://schemas.openxmlformats.org/officeDocument/2006/relationships" w:type="default" r:id="R72fa4f680d9c44e8"/>
+      <w:footerReference xmlns:r="http://schemas.openxmlformats.org/officeDocument/2006/relationships" w:type="default" r:id="Rb87d1e9a9a2c4cec"/>
       <w:pgSz w:w="11906" w:h="16838"/>
       <w:pgMar w:top="1440" w:right="1440" w:bottom="1440" w:left="1440" w:header="576" w:footer="576" w:gutter="0"/>
       <w:pgBorders w:display="allPages" w:offsetFrom="page">

</xml_diff>

<commit_message>
fix(mermaid): fix NullReferenceException when shape fill or text color is null in DocxShapeEmitter
</commit_message>
<xml_diff>
--- a/tests/docx_verify_output/emdash_sample.docx
+++ b/tests/docx_verify_output/emdash_sample.docx
@@ -91,8 +91,8 @@
       </w:pPr>
     </w:p>
     <w:sectPr>
-      <w:headerReference xmlns:r="http://schemas.openxmlformats.org/officeDocument/2006/relationships" w:type="default" r:id="R72fa4f680d9c44e8"/>
-      <w:footerReference xmlns:r="http://schemas.openxmlformats.org/officeDocument/2006/relationships" w:type="default" r:id="Rb87d1e9a9a2c4cec"/>
+      <w:headerReference xmlns:r="http://schemas.openxmlformats.org/officeDocument/2006/relationships" w:type="default" r:id="Re1f1087950334967"/>
+      <w:footerReference xmlns:r="http://schemas.openxmlformats.org/officeDocument/2006/relationships" w:type="default" r:id="Re0fd9b5dea714870"/>
       <w:pgSz w:w="11906" w:h="16838"/>
       <w:pgMar w:top="1440" w:right="1440" w:bottom="1440" w:left="1440" w:header="576" w:footer="576" w:gutter="0"/>
       <w:pgBorders w:display="allPages" w:offsetFrom="page">

</xml_diff>

<commit_message>
Enhance CPU/RAM usage, streamline test suite, and implement infinite local image limits
</commit_message>
<xml_diff>
--- a/tests/docx_verify_output/emdash_sample.docx
+++ b/tests/docx_verify_output/emdash_sample.docx
@@ -1,17 +1,17 @@
 
 <file path=word/document.xml><?xml version="1.0" encoding="utf-8"?>
-<w:document xmlns:w="http://schemas.openxmlformats.org/wordprocessingml/2006/main">
+<w:document xmlns:w14="http://schemas.microsoft.com/office/word/2010/wordml" xmlns:w15="http://schemas.microsoft.com/office/word/2012/wordml" xmlns:mc="http://schemas.openxmlformats.org/markup-compatibility/2006" xmlns:w="http://schemas.openxmlformats.org/wordprocessingml/2006/main" mc:Ignorable="w14 w15">
   <w:background w:color="FFFFFF"/>
   <w:body>
     <w:p>
       <w:r>
         <w:rPr>
-          <mc:AlternateContent xmlns:mc="http://schemas.openxmlformats.org/markup-compatibility/2006">
+          <mc:AlternateContent>
             <mc:Choice Requires="w14">
-              <w14:ligatures xmlns:w14="http://schemas.microsoft.com/office/word/2010/wordml" w14:val="standardContextual"/>
-              <w14:numForm xmlns:w14="http://schemas.microsoft.com/office/word/2010/wordml" w14:val="oldStyle"/>
-              <w14:numSpacing xmlns:w14="http://schemas.microsoft.com/office/word/2010/wordml" w14:val="proportional"/>
-              <w14:cntxtAlts xmlns:w14="http://schemas.microsoft.com/office/word/2010/wordml"/>
+              <w14:ligatures w14:val="standardContextual"/>
+              <w14:numForm w14:val="oldStyle"/>
+              <w14:numSpacing w14:val="proportional"/>
+              <w14:cntxtAlts/>
             </mc:Choice>
           </mc:AlternateContent>
         </w:rPr>
@@ -21,7 +21,6 @@
     <w:p>
       <w:pPr>
         <w:keepLines/>
-        <w:wordWrap w:val="false"/>
         <w:pBdr>
           <w:top w:val="single" w:color="D1D5DA" w:sz="4" w:space="4"/>
           <w:left w:val="single" w:color="D1D5DA" w:sz="4" w:space="4"/>
@@ -29,10 +28,12 @@
           <w:right w:val="single" w:color="D1D5DA" w:sz="4" w:space="4"/>
         </w:pBdr>
         <w:shd w:val="clear" w:color="auto" w:fill="F6F8FA"/>
+        <w:wordWrap w:val="false"/>
       </w:pPr>
       <w:r>
         <w:rPr>
           <w:rFonts w:ascii="Consolas" w:hAnsi="Consolas"/>
+          <w:noProof/>
           <w:color w:val="0000FF"/>
         </w:rPr>
         <w:t xml:space="preserve">int</w:t>
@@ -40,6 +41,7 @@
       <w:r>
         <w:rPr>
           <w:rFonts w:ascii="Consolas" w:hAnsi="Consolas"/>
+          <w:noProof/>
           <w:color w:val="24292E"/>
         </w:rPr>
         <w:t xml:space="preserve"> x = --y;</w:t>
@@ -48,12 +50,12 @@
     <w:p>
       <w:r>
         <w:rPr>
-          <mc:AlternateContent xmlns:mc="http://schemas.openxmlformats.org/markup-compatibility/2006">
+          <mc:AlternateContent>
             <mc:Choice Requires="w14">
-              <w14:ligatures xmlns:w14="http://schemas.microsoft.com/office/word/2010/wordml" w14:val="standardContextual"/>
-              <w14:numForm xmlns:w14="http://schemas.microsoft.com/office/word/2010/wordml" w14:val="oldStyle"/>
-              <w14:numSpacing xmlns:w14="http://schemas.microsoft.com/office/word/2010/wordml" w14:val="proportional"/>
-              <w14:cntxtAlts xmlns:w14="http://schemas.microsoft.com/office/word/2010/wordml"/>
+              <w14:ligatures w14:val="standardContextual"/>
+              <w14:numForm w14:val="oldStyle"/>
+              <w14:numSpacing w14:val="proportional"/>
+              <w14:cntxtAlts/>
             </mc:Choice>
           </mc:AlternateContent>
         </w:rPr>
@@ -71,12 +73,12 @@
       </w:r>
       <w:r>
         <w:rPr>
-          <mc:AlternateContent xmlns:mc="http://schemas.openxmlformats.org/markup-compatibility/2006">
+          <mc:AlternateContent>
             <mc:Choice Requires="w14">
-              <w14:ligatures xmlns:w14="http://schemas.microsoft.com/office/word/2010/wordml" w14:val="standardContextual"/>
-              <w14:numForm xmlns:w14="http://schemas.microsoft.com/office/word/2010/wordml" w14:val="oldStyle"/>
-              <w14:numSpacing xmlns:w14="http://schemas.microsoft.com/office/word/2010/wordml" w14:val="proportional"/>
-              <w14:cntxtAlts xmlns:w14="http://schemas.microsoft.com/office/word/2010/wordml"/>
+              <w14:ligatures w14:val="standardContextual"/>
+              <w14:numForm w14:val="oldStyle"/>
+              <w14:numSpacing w14:val="proportional"/>
+              <w14:cntxtAlts/>
             </mc:Choice>
           </mc:AlternateContent>
         </w:rPr>
@@ -91,8 +93,8 @@
       </w:pPr>
     </w:p>
     <w:sectPr>
-      <w:headerReference xmlns:r="http://schemas.openxmlformats.org/officeDocument/2006/relationships" w:type="default" r:id="Re1f1087950334967"/>
-      <w:footerReference xmlns:r="http://schemas.openxmlformats.org/officeDocument/2006/relationships" w:type="default" r:id="Re0fd9b5dea714870"/>
+      <w:headerReference xmlns:r="http://schemas.openxmlformats.org/officeDocument/2006/relationships" w:type="default" r:id="R38f4a2ce1e034e7f"/>
+      <w:footerReference xmlns:r="http://schemas.openxmlformats.org/officeDocument/2006/relationships" w:type="default" r:id="R2aeab691c1394039"/>
       <w:pgSz w:w="11906" w:h="16838"/>
       <w:pgMar w:top="1440" w:right="1440" w:bottom="1440" w:left="1440" w:header="576" w:footer="576" w:gutter="0"/>
       <w:pgBorders w:display="allPages" w:offsetFrom="page">
@@ -150,7 +152,7 @@
         <w:color w:val="808080"/>
         <w:sz w:val="16"/>
       </w:rPr>
-      <w:t xml:space="preserve">  Â·  Marksmith</w:t>
+      <w:t xml:space="preserve">  ·  MarkSmith</w:t>
     </w:r>
   </w:p>
 </w:ftr>
@@ -360,7 +362,7 @@
   <w:docDefaults>
     <w:rPrDefault>
       <w:rPr>
-        <w:rFonts w:ascii="Calibri" w:hAnsi="Calibri"/>
+        <w:rFonts w:ascii="Calibri" w:hAnsi="Calibri" w:eastAsia="Calibri" w:cs="Calibri"/>
         <w:color w:val="1b1f23"/>
         <w:kern w:val="16"/>
         <w:sz w:val="22"/>

</xml_diff>

<commit_message>
Optimized SVG Path Tokenizer by migrating from inline Regex instantiation within a loop to a GeneratedRegex. This improves performance and reduces allocations.
</commit_message>
<xml_diff>
--- a/tests/docx_verify_output/emdash_sample.docx
+++ b/tests/docx_verify_output/emdash_sample.docx
@@ -93,8 +93,8 @@
       </w:pPr>
     </w:p>
     <w:sectPr>
-      <w:headerReference xmlns:r="http://schemas.openxmlformats.org/officeDocument/2006/relationships" w:type="default" r:id="R4ebb0fc9912743ed"/>
-      <w:footerReference xmlns:r="http://schemas.openxmlformats.org/officeDocument/2006/relationships" w:type="default" r:id="Ree60bab07e8441bf"/>
+      <w:headerReference xmlns:r="http://schemas.openxmlformats.org/officeDocument/2006/relationships" w:type="default" r:id="R7e81a54e87104367"/>
+      <w:footerReference xmlns:r="http://schemas.openxmlformats.org/officeDocument/2006/relationships" w:type="default" r:id="R166f990db2a14837"/>
       <w:pgSz w:w="11906" w:h="16838"/>
       <w:pgMar w:top="1440" w:right="1440" w:bottom="1440" w:left="1440" w:header="576" w:footer="576" w:gutter="0"/>
     </w:sectPr>

</xml_diff>

<commit_message>
⚡ Bolt: Performance boost for DOCX regex parsing
Replaced inline `Regex.IsMatch(...)` and `new Regex(...)` usages in `DocxExportService.cs` with source-generated `[GeneratedRegex]` attributes. This eliminates per-call regex parsing, hashing overhead, and regex cache pressure, enabling allocation-free, zero-lag document processing.

Fixes applied:
- Added `[GeneratedRegex]` partial methods for python, javascript, csharp, sql, and html language detection.
- Added `[GeneratedRegex]` partial methods for hex color sniffing (3 and 6 lengths).
- Added `[GeneratedRegex]` partial method for `<font color=...>` matching.
- Made `DocxExportService` a `partial` class to support code generation.
</commit_message>
<xml_diff>
--- a/tests/docx_verify_output/emdash_sample.docx
+++ b/tests/docx_verify_output/emdash_sample.docx
@@ -93,8 +93,8 @@
       </w:pPr>
     </w:p>
     <w:sectPr>
-      <w:headerReference xmlns:r="http://schemas.openxmlformats.org/officeDocument/2006/relationships" w:type="default" r:id="R4ebb0fc9912743ed"/>
-      <w:footerReference xmlns:r="http://schemas.openxmlformats.org/officeDocument/2006/relationships" w:type="default" r:id="Ree60bab07e8441bf"/>
+      <w:headerReference xmlns:r="http://schemas.openxmlformats.org/officeDocument/2006/relationships" w:type="default" r:id="Rb41a94b74ff645bb"/>
+      <w:footerReference xmlns:r="http://schemas.openxmlformats.org/officeDocument/2006/relationships" w:type="default" r:id="Red3b3e96b45847dd"/>
       <w:pgSz w:w="11906" w:h="16838"/>
       <w:pgMar w:top="1440" w:right="1440" w:bottom="1440" w:left="1440" w:header="576" w:footer="576" w:gutter="0"/>
     </w:sectPr>

</xml_diff>